<commit_message>
Reorganizar en REV2 las determinaciones sobre la vista informal
Se sustituye la determinación única de alternativas por cuatro incisos reorganizados sin repeticiones: (1) posición del empleado ante la cesantía y solicitud principal de funciones de conductor, con su admisión de no poseer la licencia de categoría 4 (en rojo, pendiente); (2) admisiones sobre el acomodo razonable concedido y la negativa del 3 de agosto; (3) alternativas adicionales (rolo, brigada de tractores) y admisiones sobre su inviabilidad; (4) cierre de la vista y entrega de la Operator Certification con la admisión de que no constituye licencia. El párrafo introductorio se abrevia para remitir a las Determinaciones y a la sección de Admisiones.

Co-Authored-By: Claude Fable 5 <noreply@anthropic.com>

Claude-Session: https://claude.ai/code/session_015XTf7YVNkr8YeGhk2dDMDw
</commit_message>
<xml_diff>
--- a/REV2. Informe de Vista Informal Luis Vélez.docx
+++ b/REV2. Informe de Vista Informal Luis Vélez.docx
@@ -391,112 +391,7 @@
           <w:rFonts w:ascii="Times New Roman" w:hAnsi="Times New Roman" w:cs="Times New Roman"/>
           <w:lang w:eastAsia="es-PR"/>
         </w:rPr>
-        <w:t xml:space="preserve">A dicha vista compareció el señor Vélez Meléndez por derecho propio. Se procedió a atender la carta de intención de cesantía por incapacidad y se le brindó al empleado la oportunidad de expresarse y de presentar toda la evidencia a su favor. El empleado no aceptó </w:t>
-      </w:r>
-      <w:r>
-        <w:rPr>
-          <w:rFonts w:ascii="Times New Roman" w:hAnsi="Times New Roman" w:cs="Times New Roman"/>
-          <w:lang w:eastAsia="es-PR"/>
-        </w:rPr>
-        <w:t>la</w:t>
-      </w:r>
-      <w:r>
-        <w:rPr>
-          <w:rFonts w:ascii="Times New Roman" w:hAnsi="Times New Roman" w:cs="Times New Roman"/>
-          <w:lang w:eastAsia="es-PR"/>
-        </w:rPr>
-        <w:t xml:space="preserve"> cesantía por incapacidad; por el contrario, la</w:t>
-      </w:r>
-      <w:r>
-        <w:rPr>
-          <w:rFonts w:ascii="Times New Roman" w:hAnsi="Times New Roman" w:cs="Times New Roman"/>
-          <w:lang w:eastAsia="es-PR"/>
-        </w:rPr>
-        <w:t xml:space="preserve"> intentó</w:t>
-      </w:r>
-      <w:r>
-        <w:rPr>
-          <w:rFonts w:ascii="Times New Roman" w:hAnsi="Times New Roman" w:cs="Times New Roman"/>
-          <w:lang w:eastAsia="es-PR"/>
-        </w:rPr>
-        <w:t xml:space="preserve"> controv</w:t>
-      </w:r>
-      <w:r>
-        <w:rPr>
-          <w:rFonts w:ascii="Times New Roman" w:hAnsi="Times New Roman" w:cs="Times New Roman"/>
-          <w:lang w:eastAsia="es-PR"/>
-        </w:rPr>
-        <w:t>ertir</w:t>
-      </w:r>
-      <w:r>
-        <w:rPr>
-          <w:rFonts w:ascii="Times New Roman" w:hAnsi="Times New Roman" w:cs="Times New Roman"/>
-          <w:lang w:eastAsia="es-PR"/>
-        </w:rPr>
-        <w:t xml:space="preserve"> y solicitó que, en lugar de la cesantía, se le concediera un acomodo razonable consistente en asignarle funciones de con</w:t>
-      </w:r>
-      <w:r>
-        <w:rPr>
-          <w:rFonts w:ascii="Times New Roman" w:hAnsi="Times New Roman" w:cs="Times New Roman"/>
-          <w:lang w:eastAsia="es-PR"/>
-        </w:rPr>
-        <w:t>ductor (</w:t>
-      </w:r>
-      <w:r>
-        <w:rPr>
-          <w:rFonts w:ascii="Times New Roman" w:hAnsi="Times New Roman" w:cs="Times New Roman"/>
-          <w:lang w:eastAsia="es-PR"/>
-        </w:rPr>
-        <w:t>conducir el tractor cortagrama y/o un vehículo liviano de motor para transportar a sus compañeros a las áreas de trabajo y brindarles apoyo</w:t>
-      </w:r>
-      <w:r>
-        <w:rPr>
-          <w:rFonts w:ascii="Times New Roman" w:hAnsi="Times New Roman" w:cs="Times New Roman"/>
-          <w:lang w:eastAsia="es-PR"/>
-        </w:rPr>
-        <w:t>)</w:t>
-      </w:r>
-      <w:r>
-        <w:rPr>
-          <w:rFonts w:ascii="Times New Roman" w:hAnsi="Times New Roman" w:cs="Times New Roman"/>
-          <w:lang w:eastAsia="es-PR"/>
-        </w:rPr>
-        <w:t>, por entender que puede desempeñarlas sentado y que las realizó durante cerca de cuatro (4) años.</w:t>
-      </w:r>
-      <w:r>
-        <w:rPr>
-          <w:rFonts w:ascii="Times New Roman" w:hAnsi="Times New Roman" w:cs="Times New Roman"/>
-          <w:lang w:eastAsia="es-PR"/>
-        </w:rPr>
-        <w:t xml:space="preserve"> Esto a pesar de que no cumplía con el requisito de poseer una licencia de la categoría que requiere el puesto de conductor. </w:t>
-      </w:r>
-      <w:r>
-        <w:rPr>
-          <w:rFonts w:ascii="Times New Roman" w:hAnsi="Times New Roman" w:cs="Times New Roman"/>
-          <w:lang w:eastAsia="es-PR"/>
-        </w:rPr>
-        <w:t xml:space="preserve"> Confirmó que, luego del 21 de julio de 2026, no volvió a utilizar el “blower” ni el “trimmer”, y reconoció que el 3 de agosto de 2026 se negó a manejar el carretón (“dron”) de recogido por razón de su condición</w:t>
-      </w:r>
-      <w:r>
-        <w:rPr>
-          <w:rFonts w:ascii="Times New Roman" w:hAnsi="Times New Roman" w:cs="Times New Roman"/>
-          <w:lang w:eastAsia="es-PR"/>
-        </w:rPr>
-        <w:t xml:space="preserve"> médica</w:t>
-      </w:r>
-      <w:r>
-        <w:rPr>
-          <w:rFonts w:ascii="Times New Roman" w:hAnsi="Times New Roman" w:cs="Times New Roman"/>
-          <w:lang w:eastAsia="es-PR"/>
-        </w:rPr>
-        <w:t>. En determinado momento expresó interés en recalendarizar la vista para comparecer con abogado y presentar prueba adicional de sus condiciones; no obstante, optó por continuar y expresarse en la vista, la cual prosiguió hasta su conclusión sin que mediara solicitud formal de suspensión o recalendarización. Al concluir, manifestó no tener nada adicional que añadir y entregó copia de una certificación de operador (“Operator Certification”), reteniendo el original para el récord.</w:t>
-      </w:r>
-      <w:r>
-        <w:rPr>
-          <w:rFonts w:ascii="Times New Roman" w:hAnsi="Times New Roman" w:cs="Times New Roman"/>
-          <w:lang w:eastAsia="es-PR"/>
-        </w:rPr>
-        <w:t xml:space="preserve"> La certificación no constituye una licencia de conducir bajo la categoría que requiere el puesto de conductor.</w:t>
+        <w:t xml:space="preserve">A dicha vista compareció el señor Vélez Meléndez por derecho propio. Se procedió a atender la carta de intención de cesantía por incapacidad y se le brindó al empleado la oportunidad de expresarse y de presentar toda la evidencia a su favor. El empleado no aceptó la cesantía por incapacidad y la intentó controvertir. En determinado momento expresó interés en recalendarizar la vista para comparecer con abogado y presentar prueba adicional de sus condiciones; no obstante, optó por continuar y expresarse en la vista, la cual prosiguió hasta su conclusión sin que mediara solicitud formal de suspensión o recalendarización. Los planteamientos y admisiones del empleado durante la vista se consignan en las Determinaciones de Hechos y en la sección de Admisiones del Empleado de este informe.</w:t>
       </w:r>
     </w:p>
     <w:p>
@@ -2706,7 +2601,104 @@
           <w:szCs w:val="24"/>
           <w:lang w:val="es-ES"/>
         </w:rPr>
-        <w:t xml:space="preserve">El 28 de agosto de 2026 se celebró la vista administrativa informal. En ella, el empleado planteó como alternativas de acomodo: (i) que se le asignara conducir un vehículo de motor —el tractor cortagrama y/o una guagua liviana (F-350 o Silverado)— para transportar a sus compañeros a las áreas de trabajo; (ii) operar un “rolo” (rodillo/compactador) en obras públicas, para lo cual indicó poseer una certificación de operador (“Operator Certification”); (iii) integrarse a la brigada de tractores adscrita a los parques y a Recreación y Deportes; y (iv) las funciones administrativas —mensajería, archivo de documentos, llamadas telefónicas— que el Médico Ocupacional sugirió “if possible”. El empleado aclaró que no interesaba desplazar a ningún compañero, reconoció que no puede levantar peso y que ya no existe trabajo diario de tractor por haberse privatizado el mantenimiento de los parques, y entregó copia de la referida certificación de operador —que no constituye una licencia de conducir—, reteniendo el original para el récord.</w:t>
+        <w:t xml:space="preserve">En la vista administrativa informal celebrada el 28 de agosto de 2026, el empleado no aceptó la cesantía por incapacidad y solicitó que, en lugar de la cesantía, se le reubicara en otras funciones o puesto. Su planteamiento principal fue que se le asignaran funciones de conductor —conducir el tractor cortagrama y/o un vehículo liviano de motor (F-350 o Silverado) para transportar a sus compañeros a las áreas de trabajo y brindarles apoyo—, por entender que puede desempeñarlas sentado y que las realizó durante cerca de cuatro (4) años. No obstante, el propio empleado admitió que no posee la licencia de conducir de </w:t>
+      </w:r>
+      <w:r>
+        <w:rPr>
+          <w:rFonts w:ascii="Times New Roman" w:hAnsi="Times New Roman" w:cs="Times New Roman"/>
+          <w:sz w:val="24"/>
+          <w:szCs w:val="24"/>
+          <w:lang w:val="es-ES"/>
+          <w:color w:val="FF0000"/>
+        </w:rPr>
+        <w:t xml:space="preserve">categoría 4</w:t>
+      </w:r>
+      <w:r>
+        <w:rPr>
+          <w:rFonts w:ascii="Times New Roman" w:hAnsi="Times New Roman" w:cs="Times New Roman"/>
+          <w:sz w:val="24"/>
+          <w:szCs w:val="24"/>
+          <w:lang w:val="es-ES"/>
+        </w:rPr>
+        <w:t xml:space="preserve"> que exige el puesto de Conductor, por lo que no cualifica para ocupar dicho puesto.</w:t>
+      </w:r>
+    </w:p>
+    <w:p>
+      <w:pPr>
+        <w:pStyle w:val="ListParagraph"/>
+        <w:numPr>
+          <w:ilvl w:val="0"/>
+          <w:numId w:val="36"/>
+        </w:numPr>
+        <w:spacing w:after="240"/>
+        <w:contextualSpacing w:val="0"/>
+        <w:rPr>
+          <w:rFonts w:ascii="Times New Roman" w:hAnsi="Times New Roman" w:cs="Times New Roman"/>
+          <w:sz w:val="24"/>
+          <w:szCs w:val="24"/>
+          <w:lang w:val="es-ES"/>
+        </w:rPr>
+      </w:pPr>
+      <w:r>
+        <w:rPr>
+          <w:rFonts w:ascii="Times New Roman" w:hAnsi="Times New Roman" w:cs="Times New Roman"/>
+          <w:sz w:val="24"/>
+          <w:szCs w:val="24"/>
+          <w:lang w:val="es-ES"/>
+        </w:rPr>
+        <w:t xml:space="preserve">El empleado admitió que el Municipio le concedió un acomodo razonable: confirmó que, luego del 21 de julio de 2026, no volvió a utilizar el “blower” ni el “trimmer”, y que dejó de utilizar dichas herramientas a instancias del Municipio como parte de dicho acomodo. Igualmente, admitió que el 3 de agosto de 2026 se negó a manejar el carretón (“dron”) de recogido por razón de su condición médica.</w:t>
+      </w:r>
+    </w:p>
+    <w:p>
+      <w:pPr>
+        <w:pStyle w:val="ListParagraph"/>
+        <w:numPr>
+          <w:ilvl w:val="0"/>
+          <w:numId w:val="36"/>
+        </w:numPr>
+        <w:spacing w:after="240"/>
+        <w:contextualSpacing w:val="0"/>
+        <w:rPr>
+          <w:rFonts w:ascii="Times New Roman" w:hAnsi="Times New Roman" w:cs="Times New Roman"/>
+          <w:sz w:val="24"/>
+          <w:szCs w:val="24"/>
+          <w:lang w:val="es-ES"/>
+        </w:rPr>
+      </w:pPr>
+      <w:r>
+        <w:rPr>
+          <w:rFonts w:ascii="Times New Roman" w:hAnsi="Times New Roman" w:cs="Times New Roman"/>
+          <w:sz w:val="24"/>
+          <w:szCs w:val="24"/>
+          <w:lang w:val="es-ES"/>
+        </w:rPr>
+        <w:t xml:space="preserve">Como alternativas adicionales de acomodo, el empleado planteó: (i) operar un “rolo” (rodillo/compactador) en obras públicas; y (ii) integrarse a la brigada de tractores adscrita a los parques y a Recreación y Deportes, aclarando que no interesaba desplazar a ningún compañero. Sin embargo, el propio empleado reconoció que no puede levantar peso, que ya no existe trabajo diario de tractor por haberse privatizado el mantenimiento de los parques, y que no cuenta con la licencia y categoría requeridas para las funciones de conducción.</w:t>
+      </w:r>
+    </w:p>
+    <w:p>
+      <w:pPr>
+        <w:pStyle w:val="ListParagraph"/>
+        <w:numPr>
+          <w:ilvl w:val="0"/>
+          <w:numId w:val="36"/>
+        </w:numPr>
+        <w:spacing w:after="240"/>
+        <w:contextualSpacing w:val="0"/>
+        <w:rPr>
+          <w:rFonts w:ascii="Times New Roman" w:hAnsi="Times New Roman" w:cs="Times New Roman"/>
+          <w:sz w:val="24"/>
+          <w:szCs w:val="24"/>
+          <w:lang w:val="es-ES"/>
+        </w:rPr>
+      </w:pPr>
+      <w:r>
+        <w:rPr>
+          <w:rFonts w:ascii="Times New Roman" w:hAnsi="Times New Roman" w:cs="Times New Roman"/>
+          <w:sz w:val="24"/>
+          <w:szCs w:val="24"/>
+          <w:lang w:val="es-ES"/>
+        </w:rPr>
+        <w:t xml:space="preserve">Al concluir la vista, el empleado manifestó no tener nada adicional que añadir y entregó copia de una certificación de operador (“Operator Certification”), reteniendo el original para el récord. El propio empleado admitió que dicha certificación no constituye una licencia de conducir de la categoría que requiere el puesto de Conductor.</w:t>
       </w:r>
     </w:p>
     <w:p>

</xml_diff>